<commit_message>
Deploy 11add032f54ca127667782209398c5c8eb38b78e to gh-pages 11add032f54ca127667782209398c5c8eb38b78e
</commit_message>
<xml_diff>
--- a/manuscript.docx
+++ b/manuscript.docx
@@ -10,7 +10,96 @@
         <w:t xml:space="preserve">Single-cell phylogenomics from scRNA-seq SNPs using scPhylogenomics: an end-to-end workflow for clonal tumor evolution analysis</w:t>
       </w:r>
     </w:p>
-    <w:bookmarkStart w:id="9" w:name="editorial-summary"/>
+    <w:p>
+      <w:pPr>
+        <w:pStyle w:val="FirstParagraph"/>
+      </w:pPr>
+      <w:r>
+        <w:rPr>
+          <w:b/>
+          <w:bCs/>
+        </w:rPr>
+        <w:t xml:space="preserve">Eric K. Wafula</w:t>
+      </w:r>
+      <w:r>
+        <w:rPr>
+          <w:b/>
+          <w:bCs/>
+          <w:vertAlign w:val="superscript"/>
+        </w:rPr>
+        <w:t xml:space="preserve">1</w:t>
+      </w:r>
+      <w:r>
+        <w:rPr>
+          <w:b/>
+          <w:bCs/>
+        </w:rPr>
+        <w:t xml:space="preserve">, Prabin Dawdi</w:t>
+      </w:r>
+      <w:r>
+        <w:rPr>
+          <w:b/>
+          <w:bCs/>
+          <w:vertAlign w:val="superscript"/>
+        </w:rPr>
+        <w:t xml:space="preserve">1</w:t>
+      </w:r>
+      <w:r>
+        <w:rPr>
+          <w:b/>
+          <w:bCs/>
+        </w:rPr>
+        <w:t xml:space="preserve">, Sayaka Miura</w:t>
+      </w:r>
+      <w:r>
+        <w:rPr>
+          <w:b/>
+          <w:bCs/>
+          <w:vertAlign w:val="superscript"/>
+        </w:rPr>
+        <w:t xml:space="preserve">1,*</w:t>
+      </w:r>
+    </w:p>
+    <w:p>
+      <w:pPr>
+        <w:pStyle w:val="BodyText"/>
+      </w:pPr>
+      <w:r>
+        <w:rPr>
+          <w:vertAlign w:val="superscript"/>
+        </w:rPr>
+        <w:t xml:space="preserve">1</w:t>
+      </w:r>
+      <w:r>
+        <w:t xml:space="preserve">Department of Biology, The University of Mississippi, University, MS 38677, USA</w:t>
+      </w:r>
+    </w:p>
+    <w:p>
+      <w:pPr>
+        <w:pStyle w:val="BodyText"/>
+      </w:pPr>
+      <w:r>
+        <w:rPr>
+          <w:vertAlign w:val="superscript"/>
+        </w:rPr>
+        <w:t xml:space="preserve">*</w:t>
+      </w:r>
+      <w:r>
+        <w:t xml:space="preserve">Correspondence:</w:t>
+      </w:r>
+      <w:r>
+        <w:t xml:space="preserve"> </w:t>
+      </w:r>
+      <w:hyperlink r:id="rId9">
+        <w:r>
+          <w:rPr>
+            <w:rStyle w:val="Hyperlink"/>
+          </w:rPr>
+          <w:t xml:space="preserve">smiura@olemiss.edu</w:t>
+        </w:r>
+      </w:hyperlink>
+    </w:p>
+    <w:bookmarkStart w:id="10" w:name="editorial-summary"/>
     <w:p>
       <w:pPr>
         <w:pStyle w:val="Heading2"/>
@@ -70,8 +159,8 @@
         <w:t xml:space="preserve">sequencing.</w:t>
       </w:r>
     </w:p>
-    <w:bookmarkEnd w:id="9"/>
-    <w:bookmarkStart w:id="10" w:name="abstract"/>
+    <w:bookmarkEnd w:id="10"/>
+    <w:bookmarkStart w:id="11" w:name="abstract"/>
     <w:p>
       <w:pPr>
         <w:pStyle w:val="Heading2"/>
@@ -208,8 +297,8 @@
         <w:t xml:space="preserve">command‑line and containerized environments.</w:t>
       </w:r>
     </w:p>
-    <w:bookmarkEnd w:id="10"/>
-    <w:bookmarkStart w:id="11" w:name="key-references"/>
+    <w:bookmarkEnd w:id="11"/>
+    <w:bookmarkStart w:id="12" w:name="key-references"/>
     <w:p>
       <w:pPr>
         <w:pStyle w:val="Heading2"/>
@@ -339,8 +428,8 @@
         <w:t xml:space="preserve">SNPmanifold — VAE‑based clonal clustering reference (TODO: add DOI).</w:t>
       </w:r>
     </w:p>
-    <w:bookmarkEnd w:id="11"/>
-    <w:bookmarkStart w:id="17" w:name="introduction"/>
+    <w:bookmarkEnd w:id="12"/>
+    <w:bookmarkStart w:id="18" w:name="introduction"/>
     <w:p>
       <w:pPr>
         <w:pStyle w:val="Heading2"/>
@@ -612,7 +701,7 @@
         <w:t xml:space="preserve">cancer (HGSOC) samples from the MSK SPECTRUM study (SPECTRUM‑OV‑003).</w:t>
       </w:r>
     </w:p>
-    <w:bookmarkStart w:id="12" w:name="development-of-the-protocol"/>
+    <w:bookmarkStart w:id="13" w:name="development-of-the-protocol"/>
     <w:p>
       <w:pPr>
         <w:pStyle w:val="Heading3"/>
@@ -1055,8 +1144,8 @@
         <w:t xml:space="preserve">clonal architecture.</w:t>
       </w:r>
     </w:p>
-    <w:bookmarkEnd w:id="12"/>
-    <w:bookmarkStart w:id="14" w:name="overview-of-the-procedure"/>
+    <w:bookmarkEnd w:id="13"/>
+    <w:bookmarkStart w:id="15" w:name="overview-of-the-procedure"/>
     <w:p>
       <w:pPr>
         <w:pStyle w:val="Heading3"/>
@@ -1613,7 +1702,7 @@
         <w:t xml:space="preserve">execution of these scripts in detail.</w:t>
       </w:r>
     </w:p>
-    <w:bookmarkStart w:id="13" w:name="fig:workflow-overview"/>
+    <w:bookmarkStart w:id="14" w:name="fig:workflow-overview"/>
     <w:tbl>
       <w:tblPr>
         <w:tblStyle w:val="FigureTable"/>
@@ -1789,9 +1878,9 @@
         <w:t xml:space="preserve">master.</w:t>
       </w:r>
     </w:p>
-    <w:bookmarkEnd w:id="13"/>
     <w:bookmarkEnd w:id="14"/>
-    <w:bookmarkStart w:id="15" w:name="applications"/>
+    <w:bookmarkEnd w:id="15"/>
+    <w:bookmarkStart w:id="16" w:name="applications"/>
     <w:p>
       <w:pPr>
         <w:pStyle w:val="Heading3"/>
@@ -2026,8 +2115,8 @@
         <w:t xml:space="preserve">or integrative multi‑omic approaches.</w:t>
       </w:r>
     </w:p>
-    <w:bookmarkEnd w:id="15"/>
-    <w:bookmarkStart w:id="16" w:name="comparison-to-other-methods"/>
+    <w:bookmarkEnd w:id="16"/>
+    <w:bookmarkStart w:id="17" w:name="comparison-to-other-methods"/>
     <w:p>
       <w:pPr>
         <w:pStyle w:val="Heading3"/>
@@ -2380,9 +2469,9 @@
         <w:t xml:space="preserve">large datasets.</w:t>
       </w:r>
     </w:p>
-    <w:bookmarkEnd w:id="16"/>
     <w:bookmarkEnd w:id="17"/>
-    <w:bookmarkStart w:id="21" w:name="experimental-design"/>
+    <w:bookmarkEnd w:id="18"/>
+    <w:bookmarkStart w:id="22" w:name="experimental-design"/>
     <w:p>
       <w:pPr>
         <w:pStyle w:val="Heading2"/>
@@ -2391,7 +2480,7 @@
         <w:t xml:space="preserve">Experimental design</w:t>
       </w:r>
     </w:p>
-    <w:bookmarkStart w:id="18" w:name="considerations-before-starting"/>
+    <w:bookmarkStart w:id="19" w:name="considerations-before-starting"/>
     <w:p>
       <w:pPr>
         <w:pStyle w:val="Heading3"/>
@@ -2757,8 +2846,8 @@
         <w:t xml:space="preserve">, Module 4).</w:t>
       </w:r>
     </w:p>
-    <w:bookmarkEnd w:id="18"/>
-    <w:bookmarkStart w:id="19" w:name="X437ca65d6f1c0a171a87617fc29cb996557c400"/>
+    <w:bookmarkEnd w:id="19"/>
+    <w:bookmarkStart w:id="20" w:name="X437ca65d6f1c0a171a87617fc29cb996557c400"/>
     <w:p>
       <w:pPr>
         <w:pStyle w:val="Heading3"/>
@@ -2878,8 +2967,8 @@
         <w:t xml:space="preserve">evaluate clustering solutions.</w:t>
       </w:r>
     </w:p>
-    <w:bookmarkEnd w:id="19"/>
-    <w:bookmarkStart w:id="20" w:name="regulatory-approvals"/>
+    <w:bookmarkEnd w:id="20"/>
+    <w:bookmarkStart w:id="21" w:name="regulatory-approvals"/>
     <w:p>
       <w:pPr>
         <w:pStyle w:val="Heading3"/>
@@ -2944,9 +3033,9 @@
         <w:t xml:space="preserve">before downloading or analyzing patient‑derived data.</w:t>
       </w:r>
     </w:p>
-    <w:bookmarkEnd w:id="20"/>
     <w:bookmarkEnd w:id="21"/>
-    <w:bookmarkStart w:id="25" w:name="materials"/>
+    <w:bookmarkEnd w:id="22"/>
+    <w:bookmarkStart w:id="26" w:name="materials"/>
     <w:p>
       <w:pPr>
         <w:pStyle w:val="Heading2"/>
@@ -3151,7 +3240,7 @@
         <w:t xml:space="preserve">DOIs are listed.</w:t>
       </w:r>
     </w:p>
-    <w:bookmarkStart w:id="22" w:name="reagents-data"/>
+    <w:bookmarkStart w:id="23" w:name="reagents-data"/>
     <w:p>
       <w:pPr>
         <w:pStyle w:val="Heading3"/>
@@ -3444,8 +3533,8 @@
         <w:t xml:space="preserve">samples (procedure to be documented in the Materials/Procedure cross‑ref).</w:t>
       </w:r>
     </w:p>
-    <w:bookmarkEnd w:id="22"/>
-    <w:bookmarkStart w:id="23" w:name="equipment-hardware-and-software"/>
+    <w:bookmarkEnd w:id="23"/>
+    <w:bookmarkStart w:id="24" w:name="equipment-hardware-and-software"/>
     <w:p>
       <w:pPr>
         <w:pStyle w:val="Heading3"/>
@@ -4298,8 +4387,8 @@
         </w:tc>
       </w:tr>
     </w:tbl>
-    <w:bookmarkEnd w:id="23"/>
-    <w:bookmarkStart w:id="24" w:name="reagentequipment-setup"/>
+    <w:bookmarkEnd w:id="24"/>
+    <w:bookmarkStart w:id="25" w:name="reagentequipment-setup"/>
     <w:p>
       <w:pPr>
         <w:pStyle w:val="Heading3"/>
@@ -4600,9 +4689,9 @@
         <w:t xml:space="preserve">.</w:t>
       </w:r>
     </w:p>
-    <w:bookmarkEnd w:id="24"/>
     <w:bookmarkEnd w:id="25"/>
-    <w:bookmarkStart w:id="31" w:name="procedure"/>
+    <w:bookmarkEnd w:id="26"/>
+    <w:bookmarkStart w:id="32" w:name="procedure"/>
     <w:p>
       <w:pPr>
         <w:pStyle w:val="Heading2"/>
@@ -4677,7 +4766,7 @@
         <w:t xml:space="preserve">Protocols house style.</w:t>
       </w:r>
     </w:p>
-    <w:bookmarkStart w:id="26" w:name="module-1-data-preprocessing-timing-26-h"/>
+    <w:bookmarkStart w:id="27" w:name="module-1-data-preprocessing-timing-26-h"/>
     <w:p>
       <w:pPr>
         <w:pStyle w:val="Heading3"/>
@@ -5005,8 +5094,8 @@
         <w:t xml:space="preserve">.</w:t>
       </w:r>
     </w:p>
-    <w:bookmarkEnd w:id="26"/>
-    <w:bookmarkStart w:id="27" w:name="module-2-cell-typing-timing-14-h"/>
+    <w:bookmarkEnd w:id="27"/>
+    <w:bookmarkStart w:id="28" w:name="module-2-cell-typing-timing-14-h"/>
     <w:p>
       <w:pPr>
         <w:pStyle w:val="Heading3"/>
@@ -5194,8 +5283,8 @@
         <w:t xml:space="preserve">.</w:t>
       </w:r>
     </w:p>
-    <w:bookmarkEnd w:id="27"/>
-    <w:bookmarkStart w:id="28" w:name="X00ee2bf91f68c1ab706dc9cee839c495625a4ec"/>
+    <w:bookmarkEnd w:id="28"/>
+    <w:bookmarkStart w:id="29" w:name="X00ee2bf91f68c1ab706dc9cee839c495625a4ec"/>
     <w:p>
       <w:pPr>
         <w:pStyle w:val="Heading3"/>
@@ -5349,8 +5438,8 @@
         <w:t xml:space="preserve">cancers.</w:t>
       </w:r>
     </w:p>
-    <w:bookmarkEnd w:id="28"/>
-    <w:bookmarkStart w:id="29" w:name="module-4-snv-calling-timing-424-h"/>
+    <w:bookmarkEnd w:id="29"/>
+    <w:bookmarkStart w:id="30" w:name="module-4-snv-calling-timing-424-h"/>
     <w:p>
       <w:pPr>
         <w:pStyle w:val="Heading3"/>
@@ -5613,8 +5702,8 @@
         <w:t xml:space="preserve">, allele frequency thresholds).</w:t>
       </w:r>
     </w:p>
-    <w:bookmarkEnd w:id="29"/>
-    <w:bookmarkStart w:id="30" w:name="X72cb403c1cb791fca4f9a6295628ba59a4d9524"/>
+    <w:bookmarkEnd w:id="30"/>
+    <w:bookmarkStart w:id="31" w:name="X72cb403c1cb791fca4f9a6295628ba59a4d9524"/>
     <w:p>
       <w:pPr>
         <w:pStyle w:val="Heading3"/>
@@ -5878,9 +5967,9 @@
         <w:t xml:space="preserve">downstream DEG/GSEA analyses.</w:t>
       </w:r>
     </w:p>
-    <w:bookmarkEnd w:id="30"/>
     <w:bookmarkEnd w:id="31"/>
-    <w:bookmarkStart w:id="32" w:name="timing"/>
+    <w:bookmarkEnd w:id="32"/>
+    <w:bookmarkStart w:id="33" w:name="timing"/>
     <w:p>
       <w:pPr>
         <w:pStyle w:val="Heading2"/>
@@ -6218,8 +6307,8 @@
         <w:t xml:space="preserve">breakdowns where useful.</w:t>
       </w:r>
     </w:p>
-    <w:bookmarkEnd w:id="32"/>
-    <w:bookmarkStart w:id="33" w:name="troubleshooting"/>
+    <w:bookmarkEnd w:id="33"/>
+    <w:bookmarkStart w:id="34" w:name="troubleshooting"/>
     <w:p>
       <w:pPr>
         <w:pStyle w:val="Heading2"/>
@@ -6930,8 +7019,8 @@
         <w:t xml:space="preserve">during the SPECTRUM‑OV‑003 / TNBC5 / LE1 runs.</w:t>
       </w:r>
     </w:p>
-    <w:bookmarkEnd w:id="33"/>
-    <w:bookmarkStart w:id="39" w:name="anticipated-results"/>
+    <w:bookmarkEnd w:id="34"/>
+    <w:bookmarkStart w:id="40" w:name="anticipated-results"/>
     <w:p>
       <w:pPr>
         <w:pStyle w:val="Heading2"/>
@@ -6970,7 +7059,7 @@
         <w:t xml:space="preserve">figure or supplementary item.</w:t>
       </w:r>
     </w:p>
-    <w:bookmarkStart w:id="34" w:name="module-1-cleaned-featurebarcode-matrices"/>
+    <w:bookmarkStart w:id="35" w:name="module-1-cleaned-featurebarcode-matrices"/>
     <w:p>
       <w:pPr>
         <w:pStyle w:val="Heading3"/>
@@ -7035,8 +7124,8 @@
         <w:t xml:space="preserve">— insert representative QC panel for SPECTRUM‑OV‑003.</w:t>
       </w:r>
     </w:p>
-    <w:bookmarkEnd w:id="34"/>
-    <w:bookmarkStart w:id="35" w:name="module-2-referenceannotated-cell-atlas"/>
+    <w:bookmarkEnd w:id="35"/>
+    <w:bookmarkStart w:id="36" w:name="module-2-referenceannotated-cell-atlas"/>
     <w:p>
       <w:pPr>
         <w:pStyle w:val="Heading3"/>
@@ -7071,8 +7160,8 @@
         <w:t xml:space="preserve">from the tumor microenvironment.</w:t>
       </w:r>
     </w:p>
-    <w:bookmarkEnd w:id="35"/>
-    <w:bookmarkStart w:id="36" w:name="module-3-ploidy-classification"/>
+    <w:bookmarkEnd w:id="36"/>
+    <w:bookmarkStart w:id="37" w:name="module-3-ploidy-classification"/>
     <w:p>
       <w:pPr>
         <w:pStyle w:val="Heading3"/>
@@ -7143,8 +7232,8 @@
         <w:t xml:space="preserve">HGSOC samples typically exceed 70% aneuploid epithelial cells.</w:t>
       </w:r>
     </w:p>
-    <w:bookmarkEnd w:id="36"/>
-    <w:bookmarkStart w:id="37" w:name="module-4-snp-msas-and-mutation-matrices"/>
+    <w:bookmarkEnd w:id="37"/>
+    <w:bookmarkStart w:id="38" w:name="module-4-snp-msas-and-mutation-matrices"/>
     <w:p>
       <w:pPr>
         <w:pStyle w:val="Heading3"/>
@@ -7191,8 +7280,8 @@
         <w:t xml:space="preserve">thousands of SNPs across thousands of cells after default filtering.</w:t>
       </w:r>
     </w:p>
-    <w:bookmarkEnd w:id="37"/>
-    <w:bookmarkStart w:id="38" w:name="module-5-annotated-clonal-phylogenies"/>
+    <w:bookmarkEnd w:id="38"/>
+    <w:bookmarkStart w:id="39" w:name="module-5-annotated-clonal-phylogenies"/>
     <w:p>
       <w:pPr>
         <w:pStyle w:val="Heading3"/>
@@ -7299,9 +7388,9 @@
         <w:t xml:space="preserve">.</w:t>
       </w:r>
     </w:p>
-    <w:bookmarkEnd w:id="38"/>
     <w:bookmarkEnd w:id="39"/>
-    <w:bookmarkStart w:id="40" w:name="discussion"/>
+    <w:bookmarkEnd w:id="40"/>
+    <w:bookmarkStart w:id="41" w:name="discussion"/>
     <w:p>
       <w:pPr>
         <w:pStyle w:val="Heading2"/>
@@ -7430,8 +7519,8 @@
         <w:t xml:space="preserve">benchmarking against scDNA‑seq–based clonal trees.</w:t>
       </w:r>
     </w:p>
-    <w:bookmarkEnd w:id="40"/>
-    <w:bookmarkStart w:id="41" w:name="reporting-summary"/>
+    <w:bookmarkEnd w:id="41"/>
+    <w:bookmarkStart w:id="42" w:name="reporting-summary"/>
     <w:p>
       <w:pPr>
         <w:pStyle w:val="Heading2"/>
@@ -7464,8 +7553,8 @@
         <w:t xml:space="preserve">(TODO.)</w:t>
       </w:r>
     </w:p>
-    <w:bookmarkEnd w:id="41"/>
-    <w:bookmarkStart w:id="42" w:name="data-availability"/>
+    <w:bookmarkEnd w:id="42"/>
+    <w:bookmarkStart w:id="43" w:name="data-availability"/>
     <w:p>
       <w:pPr>
         <w:pStyle w:val="Heading2"/>
@@ -7577,8 +7666,8 @@
         <w:t xml:space="preserve">TODO — add accession or contact.</w:t>
       </w:r>
     </w:p>
-    <w:bookmarkEnd w:id="42"/>
-    <w:bookmarkStart w:id="43" w:name="code-availability"/>
+    <w:bookmarkEnd w:id="43"/>
+    <w:bookmarkStart w:id="44" w:name="code-availability"/>
     <w:p>
       <w:pPr>
         <w:pStyle w:val="Heading2"/>
@@ -7646,8 +7735,8 @@
         <w:t xml:space="preserve">.</w:t>
       </w:r>
     </w:p>
-    <w:bookmarkEnd w:id="43"/>
-    <w:bookmarkStart w:id="44" w:name="author-contributions"/>
+    <w:bookmarkEnd w:id="44"/>
+    <w:bookmarkStart w:id="45" w:name="author-contributions"/>
     <w:p>
       <w:pPr>
         <w:pStyle w:val="Heading2"/>
@@ -7694,8 +7783,8 @@
         <w:t xml:space="preserve">writing — review &amp; editing.</w:t>
       </w:r>
     </w:p>
-    <w:bookmarkEnd w:id="44"/>
-    <w:bookmarkStart w:id="45" w:name="acknowledgements"/>
+    <w:bookmarkEnd w:id="45"/>
+    <w:bookmarkStart w:id="46" w:name="acknowledgements"/>
     <w:p>
       <w:pPr>
         <w:pStyle w:val="Heading2"/>
@@ -7728,8 +7817,8 @@
         <w:t xml:space="preserve">Mississippi MAGIC HPC.</w:t>
       </w:r>
     </w:p>
-    <w:bookmarkEnd w:id="45"/>
-    <w:bookmarkStart w:id="46" w:name="competing-interests"/>
+    <w:bookmarkEnd w:id="46"/>
+    <w:bookmarkStart w:id="47" w:name="competing-interests"/>
     <w:p>
       <w:pPr>
         <w:pStyle w:val="Heading2"/>
@@ -7746,8 +7835,8 @@
         <w:t xml:space="preserve">The authors declare no competing interests.</w:t>
       </w:r>
     </w:p>
-    <w:bookmarkEnd w:id="46"/>
-    <w:bookmarkStart w:id="48" w:name="references"/>
+    <w:bookmarkEnd w:id="47"/>
+    <w:bookmarkStart w:id="49" w:name="references"/>
     <w:p>
       <w:pPr>
         <w:pStyle w:val="Heading2"/>
@@ -7756,9 +7845,9 @@
         <w:t xml:space="preserve">References</w:t>
       </w:r>
     </w:p>
-    <w:bookmarkStart w:id="47" w:name="refs"/>
-    <w:bookmarkEnd w:id="47"/>
+    <w:bookmarkStart w:id="48" w:name="refs"/>
     <w:bookmarkEnd w:id="48"/>
+    <w:bookmarkEnd w:id="49"/>
     <w:sectPr>
       <w:footnotePr>
         <w:numRestart w:val="eachSect"/>

</xml_diff>

<commit_message>
Deploy d58a288d3e68ca0797904dc905e01c21cd6b2f02 to gh-pages d58a288d3e68ca0797904dc905e01c21cd6b2f02
</commit_message>
<xml_diff>
--- a/manuscript.docx
+++ b/manuscript.docx
@@ -7808,13 +7808,13 @@
         <w:t xml:space="preserve"> </w:t>
       </w:r>
       <w:r>
-        <w:t xml:space="preserve">— funding sources, MSK SPECTRUM consortium acknowledgement,</w:t>
-      </w:r>
-      <w:r>
-        <w:t xml:space="preserve"> </w:t>
-      </w:r>
-      <w:r>
-        <w:t xml:space="preserve">Mississippi MAGIC HPC.</w:t>
+        <w:t xml:space="preserve">— funding sources, acknowledgements,</w:t>
+      </w:r>
+      <w:r>
+        <w:t xml:space="preserve"> </w:t>
+      </w:r>
+      <w:r>
+        <w:t xml:space="preserve">Mississippi Center for Supercomputing Research (MCSR) at Ole Miss.</w:t>
       </w:r>
     </w:p>
     <w:bookmarkEnd w:id="46"/>

</xml_diff>